<commit_message>
Merge admin/officer into brgy_sec; move Activity Log + Backup to Admin
Roles: collapse admin/officer/brgy_sec into a single Barangay Secretary
(full access). permissions.js keeps admin/officer as safe aliases until
the SQL migration converts existing accounts. SQL migrates admin/officer
-> brgy_sec, sets default role viewer, tightens the constraint to 3 roles.

Move Activity Log + Database Backup out of DILG Reports into a new
AdminTools page (/admin-tools, "System & Audit") under the Admin group.

Update use-case diagram, DATA_MODEL/DATA_PRIVACY/ARCHITECTURE/DIAGRAMS/
CODE_DEFENSE_GUIDE/TESTING_GUIDE and the testing docx accordingly.
</commit_message>
<xml_diff>
--- a/PROTECT_Testing_Guide.docx
+++ b/PROTECT_Testing_Guide.docx
@@ -79,7 +79,7 @@
         <w:pStyle w:val="ListNumber"/>
       </w:pPr>
       <w:r>
-        <w:t>Create one test account per role: Supabase &gt; Authentication &gt; Users &gt; Add user. Make a tanod and a viewer account (reuse your admin + brgy_sec).</w:t>
+        <w:t>Create one test account per role: Supabase &gt; Authentication &gt; Users &gt; Add user. Make a tanod and a viewer account (reuse your Barangay Secretary account).</w:t>
       </w:r>
     </w:p>
     <w:p>
@@ -87,7 +87,7 @@
         <w:pStyle w:val="ListNumber"/>
       </w:pPr>
       <w:r>
-        <w:t>Set their roles: log in as admin &gt; User Management &gt; edit each test user &gt; pick the role &gt; save.</w:t>
+        <w:t>Set their roles: log in as the Barangay Secretary &gt; User Management &gt; edit each test user &gt; pick the role &gt; save.</w:t>
       </w:r>
     </w:p>
     <w:p>
@@ -512,7 +512,7 @@
         <w:t xml:space="preserve">☐  </w:t>
       </w:r>
       <w:r>
-        <w:t>admin/officer/brgy_sec: all sidebar groups visible, can edit everything</w:t>
+        <w:t>brgy_sec (Barangay Secretary): all sidebar groups visible incl. Admin (User Management + System &amp; Audit), can edit everything</w:t>
       </w:r>
     </w:p>
     <w:p>
@@ -557,7 +557,7 @@
         <w:t xml:space="preserve">☐  </w:t>
       </w:r>
       <w:r>
-        <w:t>viewer: no Add/Edit/Delete buttons on any page</w:t>
+        <w:t>viewer: no Add/Edit/Delete buttons on any page; cannot see Admin pages</w:t>
       </w:r>
     </w:p>
     <w:p>
@@ -1716,6 +1716,16 @@
       </w:r>
     </w:p>
     <w:p>
+      <w:r>
+        <w:rPr>
+          <w:b/>
+          <w:color w:val="0D9E8C"/>
+          <w:sz w:val="28"/>
+        </w:rPr>
+        <w:t>18. User Management (admin)</w:t>
+      </w:r>
+    </w:p>
+    <w:p>
       <w:pPr>
         <w:spacing w:after="60"/>
         <w:ind w:left="360"/>
@@ -1727,7 +1737,62 @@
         <w:t xml:space="preserve">☐  </w:t>
       </w:r>
       <w:r>
-        <w:t>Activity Log shows recent audit entries</w:t>
+        <w:t>Lists all users with name, role badge, created date</w:t>
+      </w:r>
+    </w:p>
+    <w:p>
+      <w:pPr>
+        <w:spacing w:after="60"/>
+        <w:ind w:left="360"/>
+      </w:pPr>
+      <w:r>
+        <w:rPr>
+          <w:sz w:val="26"/>
+        </w:rPr>
+        <w:t xml:space="preserve">☐  </w:t>
+      </w:r>
+      <w:r>
+        <w:t>Edit a user: change name and role (dropdown shows only Barangay Secretary, Tanod, Viewer) saves</w:t>
+      </w:r>
+    </w:p>
+    <w:p>
+      <w:pPr>
+        <w:spacing w:after="60"/>
+        <w:ind w:left="360"/>
+      </w:pPr>
+      <w:r>
+        <w:rPr>
+          <w:sz w:val="26"/>
+        </w:rPr>
+        <w:t xml:space="preserve">☐  </w:t>
+      </w:r>
+      <w:r>
+        <w:t>Logging in as that user reflects the new access</w:t>
+      </w:r>
+    </w:p>
+    <w:p>
+      <w:r>
+        <w:rPr>
+          <w:b/>
+          <w:color w:val="0D9E8C"/>
+          <w:sz w:val="28"/>
+        </w:rPr>
+        <w:t>18a. System &amp; Audit (admin)</w:t>
+      </w:r>
+    </w:p>
+    <w:p>
+      <w:pPr>
+        <w:spacing w:after="60"/>
+        <w:ind w:left="360"/>
+      </w:pPr>
+      <w:r>
+        <w:rPr>
+          <w:sz w:val="26"/>
+        </w:rPr>
+        <w:t xml:space="preserve">☐  </w:t>
+      </w:r>
+      <w:r>
+        <w:t>Activity Log shows recent add/edit/delete entries</w:t>
       </w:r>
     </w:p>
     <w:p>
@@ -1746,16 +1811,6 @@
       </w:r>
     </w:p>
     <w:p>
-      <w:r>
-        <w:rPr>
-          <w:b/>
-          <w:color w:val="0D9E8C"/>
-          <w:sz w:val="28"/>
-        </w:rPr>
-        <w:t>18. User Management</w:t>
-      </w:r>
-    </w:p>
-    <w:p>
       <w:pPr>
         <w:spacing w:after="60"/>
         <w:ind w:left="360"/>
@@ -1767,37 +1822,7 @@
         <w:t xml:space="preserve">☐  </w:t>
       </w:r>
       <w:r>
-        <w:t>Lists all users with name, role badge, created date</w:t>
-      </w:r>
-    </w:p>
-    <w:p>
-      <w:pPr>
-        <w:spacing w:after="60"/>
-        <w:ind w:left="360"/>
-      </w:pPr>
-      <w:r>
-        <w:rPr>
-          <w:sz w:val="26"/>
-        </w:rPr>
-        <w:t xml:space="preserve">☐  </w:t>
-      </w:r>
-      <w:r>
-        <w:t>Edit a user: change name and role (dropdown has NO DILG rep) saves</w:t>
-      </w:r>
-    </w:p>
-    <w:p>
-      <w:pPr>
-        <w:spacing w:after="60"/>
-        <w:ind w:left="360"/>
-      </w:pPr>
-      <w:r>
-        <w:rPr>
-          <w:sz w:val="26"/>
-        </w:rPr>
-        <w:t xml:space="preserve">☐  </w:t>
-      </w:r>
-      <w:r>
-        <w:t>Logging in as that user reflects the new access</w:t>
+        <w:t>A viewer cannot open System &amp; Audit (not in sidebar / Access Restricted)</w:t>
       </w:r>
     </w:p>
     <w:p>

</xml_diff>

<commit_message>
Remove the viewer role — system now has Barangay Secretary + Tanod only
Drop the read-only viewer role everywhere. Accounts with no role are
"unassigned" (no access beyond the Dashboard) until an admin assigns
brgy_sec or tanod. SQL migrates viewer -> NULL, makes role nullable with
no default, constraint = (brgy_sec, tanod). Updated permissions, App,
Layout, UserManagement, SQL, docs, and the testing docx.
</commit_message>
<xml_diff>
--- a/PROTECT_Testing_Guide.docx
+++ b/PROTECT_Testing_Guide.docx
@@ -79,7 +79,7 @@
         <w:pStyle w:val="ListNumber"/>
       </w:pPr>
       <w:r>
-        <w:t>Create one test account per role: Supabase &gt; Authentication &gt; Users &gt; Add user. Make a tanod and a viewer account (reuse your Barangay Secretary account).</w:t>
+        <w:t>Create a test tanod account: Supabase &gt; Authentication &gt; Users &gt; Add user (reuse your Barangay Secretary account for full-access testing).</w:t>
       </w:r>
     </w:p>
     <w:p>
@@ -402,7 +402,7 @@
         <w:t xml:space="preserve">☐  </w:t>
       </w:r>
       <w:r>
-        <w:t>Have one login per role: admin/officer/brgy_sec, tanod, viewer</w:t>
+        <w:t>Have one login per role: brgy_sec (Barangay Secretary) and tanod</w:t>
       </w:r>
     </w:p>
     <w:p>
@@ -557,7 +557,7 @@
         <w:t xml:space="preserve">☐  </w:t>
       </w:r>
       <w:r>
-        <w:t>viewer: no Add/Edit/Delete buttons on any page; cannot see Admin pages</w:t>
+        <w:t>unassigned account (no role yet): no access beyond the Dashboard until an admin assigns a role</w:t>
       </w:r>
     </w:p>
     <w:p>
@@ -1152,7 +1152,7 @@
         <w:t xml:space="preserve">☐  </w:t>
       </w:r>
       <w:r>
-        <w:t>viewer cannot pin/edit/remove</w:t>
+        <w:t>tanod: GIS Map not in sidebar / Access Restricted</w:t>
       </w:r>
     </w:p>
     <w:p>
@@ -1337,7 +1337,7 @@
         <w:t xml:space="preserve">☐  </w:t>
       </w:r>
       <w:r>
-        <w:t>viewer cannot add/remove zones</w:t>
+        <w:t>tanod: Disaster Vulnerability not in sidebar / Access Restricted</w:t>
       </w:r>
     </w:p>
     <w:p>
@@ -1522,7 +1522,7 @@
         <w:t xml:space="preserve">☐  </w:t>
       </w:r>
       <w:r>
-        <w:t>viewer has no log form and no status dropdown</w:t>
+        <w:t>tanod CAN log incidents + change status (this is a tanod page)</w:t>
       </w:r>
     </w:p>
     <w:p>
@@ -1752,7 +1752,7 @@
         <w:t xml:space="preserve">☐  </w:t>
       </w:r>
       <w:r>
-        <w:t>Edit a user: change name and role (dropdown shows only Barangay Secretary, Tanod, Viewer) saves</w:t>
+        <w:t>Edit a user: change name and role (dropdown shows only Barangay Secretary, Tanod) saves</w:t>
       </w:r>
     </w:p>
     <w:p>
@@ -1822,7 +1822,7 @@
         <w:t xml:space="preserve">☐  </w:t>
       </w:r>
       <w:r>
-        <w:t>A viewer cannot open System &amp; Audit (not in sidebar / Access Restricted)</w:t>
+        <w:t>A tanod cannot open System &amp; Audit (not in sidebar / Access Restricted)</w:t>
       </w:r>
     </w:p>
     <w:p>

</xml_diff>